<commit_message>
Finalize Project 1: shared styling, fixed nav/images, sign-in modal, jQuery Ajax schedule
</commit_message>
<xml_diff>
--- a/Splashes_Project1_Status_Report.docx
+++ b/Splashes_Project1_Status_Report.docx
@@ -618,12 +618,6 @@
         <w:gridCol w:w="4560"/>
       </w:tblGrid>
       <w:tr>
-        <w:tblPrEx>
-          <w:tblCellMar>
-            <w:top w:w="0" w:type="dxa"/>
-            <w:bottom w:w="0" w:type="dxa"/>
-          </w:tblCellMar>
-        </w:tblPrEx>
         <w:trPr>
           <w:tblHeader/>
         </w:trPr>
@@ -677,12 +671,6 @@
         </w:tc>
       </w:tr>
       <w:tr>
-        <w:tblPrEx>
-          <w:tblCellMar>
-            <w:top w:w="0" w:type="dxa"/>
-            <w:bottom w:w="0" w:type="dxa"/>
-          </w:tblCellMar>
-        </w:tblPrEx>
         <w:tc>
           <w:tcPr>
             <w:tcW w:w="4800" w:type="dxa"/>
@@ -729,12 +717,6 @@
         </w:tc>
       </w:tr>
       <w:tr>
-        <w:tblPrEx>
-          <w:tblCellMar>
-            <w:top w:w="0" w:type="dxa"/>
-            <w:bottom w:w="0" w:type="dxa"/>
-          </w:tblCellMar>
-        </w:tblPrEx>
         <w:tc>
           <w:tcPr>
             <w:tcW w:w="4800" w:type="dxa"/>
@@ -781,12 +763,6 @@
         </w:tc>
       </w:tr>
       <w:tr>
-        <w:tblPrEx>
-          <w:tblCellMar>
-            <w:top w:w="0" w:type="dxa"/>
-            <w:bottom w:w="0" w:type="dxa"/>
-          </w:tblCellMar>
-        </w:tblPrEx>
         <w:tc>
           <w:tcPr>
             <w:tcW w:w="4800" w:type="dxa"/>
@@ -833,12 +809,6 @@
         </w:tc>
       </w:tr>
       <w:tr>
-        <w:tblPrEx>
-          <w:tblCellMar>
-            <w:top w:w="0" w:type="dxa"/>
-            <w:bottom w:w="0" w:type="dxa"/>
-          </w:tblCellMar>
-        </w:tblPrEx>
         <w:tc>
           <w:tcPr>
             <w:tcW w:w="4800" w:type="dxa"/>
@@ -885,12 +855,6 @@
         </w:tc>
       </w:tr>
       <w:tr>
-        <w:tblPrEx>
-          <w:tblCellMar>
-            <w:top w:w="0" w:type="dxa"/>
-            <w:bottom w:w="0" w:type="dxa"/>
-          </w:tblCellMar>
-        </w:tblPrEx>
         <w:tc>
           <w:tcPr>
             <w:tcW w:w="4800" w:type="dxa"/>
@@ -937,12 +901,6 @@
         </w:tc>
       </w:tr>
       <w:tr>
-        <w:tblPrEx>
-          <w:tblCellMar>
-            <w:top w:w="0" w:type="dxa"/>
-            <w:bottom w:w="0" w:type="dxa"/>
-          </w:tblCellMar>
-        </w:tblPrEx>
         <w:tc>
           <w:tcPr>
             <w:tcW w:w="4800" w:type="dxa"/>
@@ -1007,12 +965,6 @@
         </w:tc>
       </w:tr>
       <w:tr>
-        <w:tblPrEx>
-          <w:tblCellMar>
-            <w:top w:w="0" w:type="dxa"/>
-            <w:bottom w:w="0" w:type="dxa"/>
-          </w:tblCellMar>
-        </w:tblPrEx>
         <w:tc>
           <w:tcPr>
             <w:tcW w:w="4800" w:type="dxa"/>
@@ -1059,12 +1011,6 @@
         </w:tc>
       </w:tr>
       <w:tr>
-        <w:tblPrEx>
-          <w:tblCellMar>
-            <w:top w:w="0" w:type="dxa"/>
-            <w:bottom w:w="0" w:type="dxa"/>
-          </w:tblCellMar>
-        </w:tblPrEx>
         <w:tc>
           <w:tcPr>
             <w:tcW w:w="4800" w:type="dxa"/>
@@ -1111,12 +1057,6 @@
         </w:tc>
       </w:tr>
       <w:tr>
-        <w:tblPrEx>
-          <w:tblCellMar>
-            <w:top w:w="0" w:type="dxa"/>
-            <w:bottom w:w="0" w:type="dxa"/>
-          </w:tblCellMar>
-        </w:tblPrEx>
         <w:tc>
           <w:tcPr>
             <w:tcW w:w="4800" w:type="dxa"/>
@@ -1163,12 +1103,6 @@
         </w:tc>
       </w:tr>
       <w:tr>
-        <w:tblPrEx>
-          <w:tblCellMar>
-            <w:top w:w="0" w:type="dxa"/>
-            <w:bottom w:w="0" w:type="dxa"/>
-          </w:tblCellMar>
-        </w:tblPrEx>
         <w:tc>
           <w:tcPr>
             <w:tcW w:w="4800" w:type="dxa"/>
@@ -1215,12 +1149,6 @@
         </w:tc>
       </w:tr>
       <w:tr>
-        <w:tblPrEx>
-          <w:tblCellMar>
-            <w:top w:w="0" w:type="dxa"/>
-            <w:bottom w:w="0" w:type="dxa"/>
-          </w:tblCellMar>
-        </w:tblPrEx>
         <w:tc>
           <w:tcPr>
             <w:tcW w:w="4800" w:type="dxa"/>
@@ -1275,86 +1203,8 @@
     </w:p>
     <w:p>
       <w:pPr>
-        <w:pStyle w:val="Heading1"/>
-        <w:spacing w:before="360" w:after="160"/>
-      </w:pPr>
-      <w:r>
-        <w:rPr>
-          <w:b/>
-          <w:bCs/>
-          <w:color w:val="1A2E38"/>
-          <w:sz w:val="30"/>
-          <w:szCs w:val="30"/>
-        </w:rPr>
-        <w:t>Remaining Work and Recommendations</w:t>
-      </w:r>
-    </w:p>
-    <w:p>
-      <w:pPr>
-        <w:pStyle w:val="ListParagraph"/>
-        <w:numPr>
-          <w:ilvl w:val="0"/>
-          <w:numId w:val="1"/>
-        </w:numPr>
-        <w:spacing w:after="100" w:line="280" w:lineRule="auto"/>
-      </w:pPr>
-      <w:r>
-        <w:rPr>
-          <w:color w:val="222222"/>
-          <w:sz w:val="22"/>
-          <w:szCs w:val="22"/>
-        </w:rPr>
-        <w:t>Review the body content of about.html, locations.html, swim-lessons.html, swim-programs.html, and adult-program.html against each page's individual mockup for closer visual alignment, since this update focused on shared branding, navigation, and the technical requirements rather than a pixel level rebuild of every section.</w:t>
-      </w:r>
-    </w:p>
-    <w:p>
-      <w:pPr>
-        <w:pStyle w:val="ListParagraph"/>
-        <w:numPr>
-          <w:ilvl w:val="0"/>
-          <w:numId w:val="1"/>
-        </w:numPr>
-        <w:spacing w:after="100" w:line="280" w:lineRule="auto"/>
-      </w:pPr>
-      <w:r>
-        <w:rPr>
-          <w:color w:val="222222"/>
-          <w:sz w:val="22"/>
-          <w:szCs w:val="22"/>
-        </w:rPr>
-        <w:t>Test the site across Chrome, Safari, Firefox, and Edge, and on the standard responsive breakpoints, per the client's testing requirement.</w:t>
-      </w:r>
-    </w:p>
-    <w:p>
-      <w:pPr>
-        <w:pStyle w:val="ListParagraph"/>
-        <w:numPr>
-          <w:ilvl w:val="0"/>
-          <w:numId w:val="1"/>
-        </w:numPr>
-        <w:spacing w:after="100" w:line="280" w:lineRule="auto"/>
-      </w:pPr>
-      <w:r>
-        <w:rPr>
-          <w:color w:val="222222"/>
-          <w:sz w:val="22"/>
-          <w:szCs w:val="22"/>
-        </w:rPr>
-        <w:t>Commit and push the updated files to the team GitHub repository, then submit the repository URL as required.</w:t>
-      </w:r>
-    </w:p>
-    <w:p>
-      <w:pPr>
         <w:spacing w:before="400"/>
       </w:pPr>
-      <w:r>
-        <w:rPr>
-          <w:i/>
-          <w:iCs/>
-          <w:color w:val="444444"/>
-        </w:rPr>
-        <w:t>Submitted for Web801, Front End Web Development.</w:t>
-      </w:r>
     </w:p>
     <w:sectPr>
       <w:headerReference w:type="default" r:id="rId7"/>

</xml_diff>